<commit_message>
refactor(assets): reorganaize forms and css
</commit_message>
<xml_diff>
--- a/assets/templates/Пакет документов без психиатрического освидетельствования.docx
+++ b/assets/templates/Пакет документов без психиатрического освидетельствования.docx
@@ -14,7 +14,7 @@
           <w:bottom w:w="0" w:type="dxa"/>
           <w:end w:w="0" w:type="dxa"/>
         </w:tblCellMar>
-        <w:tblLook w:val="04a0" w:noHBand="0" w:noVBand="1" w:firstColumn="1" w:lastRow="0" w:lastColumn="0" w:firstRow="1"/>
+        <w:tblLook w:noHBand="0" w:noVBand="1" w:firstColumn="1" w:lastRow="0" w:lastColumn="0" w:firstRow="1" w:val="04a0"/>
       </w:tblPr>
       <w:tblGrid>
         <w:gridCol w:w="4960"/>
@@ -1038,7 +1038,7 @@
           <w:bottom w:w="0" w:type="dxa"/>
           <w:end w:w="0" w:type="dxa"/>
         </w:tblCellMar>
-        <w:tblLook w:val="04a0" w:noHBand="0" w:noVBand="1" w:firstColumn="1" w:lastRow="0" w:lastColumn="0" w:firstRow="1"/>
+        <w:tblLook w:noHBand="0" w:noVBand="1" w:firstColumn="1" w:lastRow="0" w:lastColumn="0" w:firstRow="1" w:val="04a0"/>
       </w:tblPr>
       <w:tblGrid>
         <w:gridCol w:w="4960"/>
@@ -1107,7 +1107,14 @@
               </w:rPr>
             </w:pPr>
             <w:r>
-              <w:rPr/>
+              <w:rPr>
+                <w:rFonts w:eastAsia="Calibri" w:cs="Times New Roman"/>
+                <w:kern w:val="0"/>
+                <w:sz w:val="20"/>
+                <w:szCs w:val="20"/>
+                <w:lang w:eastAsia="ru-RU"/>
+                <w14:ligatures w14:val="none"/>
+              </w:rPr>
             </w:r>
           </w:p>
         </w:tc>
@@ -1203,7 +1210,13 @@
               </w:rPr>
             </w:pPr>
             <w:r>
-              <w:rPr/>
+              <w:rPr>
+                <w:rFonts w:eastAsia="Calibri" w:cs="Times New Roman"/>
+                <w:kern w:val="0"/>
+                <w:szCs w:val="28"/>
+                <w:lang w:eastAsia="ru-RU"/>
+                <w14:ligatures w14:val="none"/>
+              </w:rPr>
             </w:r>
           </w:p>
         </w:tc>
@@ -1232,7 +1245,13 @@
               </w:rPr>
             </w:pPr>
             <w:r>
-              <w:rPr/>
+              <w:rPr>
+                <w:rFonts w:eastAsia="Calibri" w:cs="Times New Roman"/>
+                <w:kern w:val="0"/>
+                <w:szCs w:val="28"/>
+                <w:lang w:eastAsia="ru-RU"/>
+                <w14:ligatures w14:val="none"/>
+              </w:rPr>
             </w:r>
           </w:p>
         </w:tc>
@@ -1260,7 +1279,13 @@
               </w:rPr>
             </w:pPr>
             <w:r>
-              <w:rPr/>
+              <w:rPr>
+                <w:rFonts w:eastAsia="Calibri" w:cs="Times New Roman"/>
+                <w:kern w:val="0"/>
+                <w:szCs w:val="28"/>
+                <w:lang w:eastAsia="ru-RU"/>
+                <w14:ligatures w14:val="none"/>
+              </w:rPr>
             </w:r>
           </w:p>
         </w:tc>
@@ -1283,7 +1308,13 @@
               </w:rPr>
             </w:pPr>
             <w:r>
-              <w:rPr/>
+              <w:rPr>
+                <w:rFonts w:eastAsia="Calibri" w:cs="Times New Roman"/>
+                <w:kern w:val="0"/>
+                <w:szCs w:val="28"/>
+                <w:lang w:eastAsia="ru-RU"/>
+                <w14:ligatures w14:val="none"/>
+              </w:rPr>
             </w:r>
           </w:p>
         </w:tc>
@@ -1312,7 +1343,13 @@
               </w:rPr>
             </w:pPr>
             <w:r>
-              <w:rPr/>
+              <w:rPr>
+                <w:rFonts w:eastAsia="Calibri" w:cs="Times New Roman"/>
+                <w:kern w:val="0"/>
+                <w:szCs w:val="28"/>
+                <w:lang w:eastAsia="ru-RU"/>
+                <w14:ligatures w14:val="none"/>
+              </w:rPr>
             </w:r>
           </w:p>
         </w:tc>
@@ -1340,7 +1377,13 @@
               </w:rPr>
             </w:pPr>
             <w:r>
-              <w:rPr/>
+              <w:rPr>
+                <w:rFonts w:eastAsia="Calibri" w:cs="Times New Roman"/>
+                <w:kern w:val="0"/>
+                <w:szCs w:val="28"/>
+                <w:lang w:eastAsia="ru-RU"/>
+                <w14:ligatures w14:val="none"/>
+              </w:rPr>
             </w:r>
           </w:p>
         </w:tc>
@@ -1363,7 +1406,13 @@
               </w:rPr>
             </w:pPr>
             <w:r>
-              <w:rPr/>
+              <w:rPr>
+                <w:rFonts w:eastAsia="Calibri" w:cs="Times New Roman"/>
+                <w:kern w:val="0"/>
+                <w:szCs w:val="28"/>
+                <w:lang w:eastAsia="ru-RU"/>
+                <w14:ligatures w14:val="none"/>
+              </w:rPr>
             </w:r>
           </w:p>
         </w:tc>
@@ -1392,7 +1441,13 @@
               </w:rPr>
             </w:pPr>
             <w:r>
-              <w:rPr/>
+              <w:rPr>
+                <w:rFonts w:eastAsia="Calibri" w:cs="Times New Roman"/>
+                <w:kern w:val="0"/>
+                <w:szCs w:val="28"/>
+                <w:lang w:eastAsia="ru-RU"/>
+                <w14:ligatures w14:val="none"/>
+              </w:rPr>
             </w:r>
           </w:p>
         </w:tc>
@@ -1421,7 +1476,13 @@
               </w:rPr>
             </w:pPr>
             <w:r>
-              <w:rPr/>
+              <w:rPr>
+                <w:rFonts w:eastAsia="Calibri" w:cs="Times New Roman"/>
+                <w:kern w:val="0"/>
+                <w:szCs w:val="28"/>
+                <w:lang w:eastAsia="ru-RU"/>
+                <w14:ligatures w14:val="none"/>
+              </w:rPr>
             </w:r>
           </w:p>
         </w:tc>
@@ -1452,7 +1513,15 @@
               </w:rPr>
             </w:pPr>
             <w:r>
-              <w:rPr/>
+              <w:rPr>
+                <w:rFonts w:eastAsia="Calibri" w:cs="Times New Roman"/>
+                <w:b/>
+                <w:bCs/>
+                <w:kern w:val="0"/>
+                <w:szCs w:val="28"/>
+                <w:lang w:val="en-US" w:eastAsia="ru-RU"/>
+                <w14:ligatures w14:val="none"/>
+              </w:rPr>
             </w:r>
           </w:p>
         </w:tc>
@@ -1481,7 +1550,13 @@
               </w:rPr>
             </w:pPr>
             <w:r>
-              <w:rPr/>
+              <w:rPr>
+                <w:rFonts w:eastAsia="Calibri" w:cs="Times New Roman"/>
+                <w:kern w:val="0"/>
+                <w:szCs w:val="28"/>
+                <w:lang w:eastAsia="ru-RU"/>
+                <w14:ligatures w14:val="none"/>
+              </w:rPr>
             </w:r>
           </w:p>
         </w:tc>
@@ -1510,7 +1585,13 @@
               </w:rPr>
             </w:pPr>
             <w:r>
-              <w:rPr/>
+              <w:rPr>
+                <w:rFonts w:eastAsia="Calibri" w:cs="Times New Roman"/>
+                <w:kern w:val="0"/>
+                <w:szCs w:val="28"/>
+                <w:lang w:eastAsia="ru-RU"/>
+                <w14:ligatures w14:val="none"/>
+              </w:rPr>
             </w:r>
           </w:p>
         </w:tc>
@@ -1539,7 +1620,13 @@
               </w:rPr>
             </w:pPr>
             <w:r>
-              <w:rPr/>
+              <w:rPr>
+                <w:rFonts w:eastAsia="Calibri" w:cs="Times New Roman"/>
+                <w:kern w:val="0"/>
+                <w:szCs w:val="28"/>
+                <w:lang w:eastAsia="ru-RU"/>
+                <w14:ligatures w14:val="none"/>
+              </w:rPr>
             </w:r>
           </w:p>
         </w:tc>
@@ -1568,7 +1655,13 @@
               </w:rPr>
             </w:pPr>
             <w:r>
-              <w:rPr/>
+              <w:rPr>
+                <w:rFonts w:eastAsia="Calibri" w:cs="Times New Roman"/>
+                <w:kern w:val="0"/>
+                <w:szCs w:val="28"/>
+                <w:lang w:eastAsia="ru-RU"/>
+                <w14:ligatures w14:val="none"/>
+              </w:rPr>
             </w:r>
           </w:p>
         </w:tc>
@@ -1689,12 +1782,12 @@
           <w:bottom w:w="0" w:type="dxa"/>
           <w:end w:w="0" w:type="dxa"/>
         </w:tblCellMar>
-        <w:tblLook w:val="04a0" w:noHBand="0" w:noVBand="1" w:firstColumn="1" w:lastRow="0" w:lastColumn="0" w:firstRow="1"/>
+        <w:tblLook w:noHBand="0" w:noVBand="1" w:firstColumn="1" w:lastRow="0" w:lastColumn="0" w:firstRow="1" w:val="04a0"/>
       </w:tblPr>
       <w:tblGrid>
         <w:gridCol w:w="1843"/>
-        <w:gridCol w:w="565"/>
-        <w:gridCol w:w="994"/>
+        <w:gridCol w:w="564"/>
+        <w:gridCol w:w="995"/>
         <w:gridCol w:w="2694"/>
         <w:gridCol w:w="4677"/>
       </w:tblGrid>
@@ -1704,7 +1797,7 @@
         </w:trPr>
         <w:tc>
           <w:tcPr>
-            <w:tcW w:w="2408" w:type="dxa"/>
+            <w:tcW w:w="2407" w:type="dxa"/>
             <w:gridSpan w:val="2"/>
             <w:tcBorders/>
             <w:vAlign w:val="bottom"/>
@@ -1738,7 +1831,7 @@
         </w:tc>
         <w:tc>
           <w:tcPr>
-            <w:tcW w:w="8365" w:type="dxa"/>
+            <w:tcW w:w="8366" w:type="dxa"/>
             <w:gridSpan w:val="3"/>
             <w:tcBorders>
               <w:bottom w:val="single" w:sz="4" w:space="0" w:color="000000"/>
@@ -2142,7 +2235,7 @@
           <w:bottom w:w="0" w:type="dxa"/>
           <w:end w:w="5" w:type="dxa"/>
         </w:tblCellMar>
-        <w:tblLook w:val="01e0" w:noHBand="0" w:noVBand="0" w:firstColumn="1" w:lastRow="1" w:lastColumn="1" w:firstRow="1"/>
+        <w:tblLook w:noHBand="0" w:noVBand="0" w:firstColumn="1" w:lastRow="1" w:lastColumn="1" w:firstRow="1" w:val="01e0"/>
       </w:tblPr>
       <w:tblGrid>
         <w:gridCol w:w="2686"/>
@@ -2395,7 +2488,7 @@
           <w:bottom w:w="0" w:type="dxa"/>
           <w:end w:w="0" w:type="dxa"/>
         </w:tblCellMar>
-        <w:tblLook w:val="01e0" w:noHBand="0" w:noVBand="0" w:firstColumn="1" w:lastRow="1" w:lastColumn="1" w:firstRow="1"/>
+        <w:tblLook w:noHBand="0" w:noVBand="0" w:firstColumn="1" w:lastRow="1" w:lastColumn="1" w:firstRow="1" w:val="01e0"/>
       </w:tblPr>
       <w:tblGrid>
         <w:gridCol w:w="2686"/>
@@ -2647,7 +2740,7 @@
           <w:bottom w:w="0" w:type="dxa"/>
           <w:end w:w="0" w:type="dxa"/>
         </w:tblCellMar>
-        <w:tblLook w:val="01e0" w:noHBand="0" w:noVBand="0" w:firstColumn="1" w:lastRow="1" w:lastColumn="1" w:firstRow="1"/>
+        <w:tblLook w:noHBand="0" w:noVBand="0" w:firstColumn="1" w:lastRow="1" w:lastColumn="1" w:firstRow="1" w:val="01e0"/>
       </w:tblPr>
       <w:tblGrid>
         <w:gridCol w:w="4785"/>
@@ -2798,12 +2891,12 @@
           <w:bottom w:w="0" w:type="dxa"/>
           <w:end w:w="0" w:type="dxa"/>
         </w:tblCellMar>
-        <w:tblLook w:val="04a0" w:noHBand="0" w:noVBand="1" w:firstColumn="1" w:lastRow="0" w:lastColumn="0" w:firstRow="1"/>
+        <w:tblLook w:noHBand="0" w:noVBand="1" w:firstColumn="1" w:lastRow="0" w:lastColumn="0" w:firstRow="1" w:val="04a0"/>
       </w:tblPr>
       <w:tblGrid>
         <w:gridCol w:w="1843"/>
-        <w:gridCol w:w="565"/>
-        <w:gridCol w:w="994"/>
+        <w:gridCol w:w="564"/>
+        <w:gridCol w:w="995"/>
         <w:gridCol w:w="2694"/>
         <w:gridCol w:w="4677"/>
       </w:tblGrid>
@@ -2811,7 +2904,7 @@
         <w:trPr/>
         <w:tc>
           <w:tcPr>
-            <w:tcW w:w="2408" w:type="dxa"/>
+            <w:tcW w:w="2407" w:type="dxa"/>
             <w:gridSpan w:val="2"/>
             <w:tcBorders/>
             <w:vAlign w:val="bottom"/>
@@ -2845,7 +2938,7 @@
         </w:tc>
         <w:tc>
           <w:tcPr>
-            <w:tcW w:w="8365" w:type="dxa"/>
+            <w:tcW w:w="8366" w:type="dxa"/>
             <w:gridSpan w:val="3"/>
             <w:tcBorders>
               <w:bottom w:val="single" w:sz="4" w:space="0" w:color="000000"/>
@@ -3225,7 +3318,7 @@
           <w:bottom w:w="0" w:type="dxa"/>
           <w:end w:w="5" w:type="dxa"/>
         </w:tblCellMar>
-        <w:tblLook w:val="01e0" w:noHBand="0" w:noVBand="0" w:firstColumn="1" w:lastRow="1" w:lastColumn="1" w:firstRow="1"/>
+        <w:tblLook w:noHBand="0" w:noVBand="0" w:firstColumn="1" w:lastRow="1" w:lastColumn="1" w:firstRow="1" w:val="01e0"/>
       </w:tblPr>
       <w:tblGrid>
         <w:gridCol w:w="2686"/>
@@ -3478,7 +3571,7 @@
           <w:bottom w:w="0" w:type="dxa"/>
           <w:end w:w="0" w:type="dxa"/>
         </w:tblCellMar>
-        <w:tblLook w:val="01e0" w:noHBand="0" w:noVBand="0" w:firstColumn="1" w:lastRow="1" w:lastColumn="1" w:firstRow="1"/>
+        <w:tblLook w:noHBand="0" w:noVBand="0" w:firstColumn="1" w:lastRow="1" w:lastColumn="1" w:firstRow="1" w:val="01e0"/>
       </w:tblPr>
       <w:tblGrid>
         <w:gridCol w:w="2686"/>
@@ -3730,7 +3823,7 @@
           <w:bottom w:w="0" w:type="dxa"/>
           <w:end w:w="0" w:type="dxa"/>
         </w:tblCellMar>
-        <w:tblLook w:val="01e0" w:noHBand="0" w:noVBand="0" w:firstColumn="1" w:lastRow="1" w:lastColumn="1" w:firstRow="1"/>
+        <w:tblLook w:noHBand="0" w:noVBand="0" w:firstColumn="1" w:lastRow="1" w:lastColumn="1" w:firstRow="1" w:val="01e0"/>
       </w:tblPr>
       <w:tblGrid>
         <w:gridCol w:w="4785"/>
@@ -3824,7 +3917,7 @@
           <w:bottom w:w="0" w:type="dxa"/>
           <w:end w:w="30" w:type="dxa"/>
         </w:tblCellMar>
-        <w:tblLook w:val="04a0" w:noHBand="0" w:noVBand="1" w:firstColumn="1" w:lastRow="0" w:lastColumn="0" w:firstRow="1"/>
+        <w:tblLook w:noHBand="0" w:noVBand="1" w:firstColumn="1" w:lastRow="0" w:lastColumn="0" w:firstRow="1" w:val="04a0"/>
       </w:tblPr>
       <w:tblGrid>
         <w:gridCol w:w="2196"/>
@@ -3833,14 +3926,14 @@
         <w:gridCol w:w="375"/>
         <w:gridCol w:w="723"/>
         <w:gridCol w:w="1"/>
-        <w:gridCol w:w="354"/>
-        <w:gridCol w:w="31"/>
+        <w:gridCol w:w="353"/>
+        <w:gridCol w:w="32"/>
         <w:gridCol w:w="503"/>
         <w:gridCol w:w="209"/>
-        <w:gridCol w:w="645"/>
-        <w:gridCol w:w="544"/>
-        <w:gridCol w:w="94"/>
-        <w:gridCol w:w="913"/>
+        <w:gridCol w:w="644"/>
+        <w:gridCol w:w="545"/>
+        <w:gridCol w:w="93"/>
+        <w:gridCol w:w="914"/>
         <w:gridCol w:w="855"/>
         <w:gridCol w:w="1341"/>
       </w:tblGrid>
@@ -4005,7 +4098,7 @@
         </w:trPr>
         <w:tc>
           <w:tcPr>
-            <w:tcW w:w="5845" w:type="dxa"/>
+            <w:tcW w:w="5844" w:type="dxa"/>
             <w:gridSpan w:val="7"/>
             <w:tcBorders>
               <w:top w:val="single" w:sz="4" w:space="0" w:color="000000"/>
@@ -4052,7 +4145,7 @@
         </w:tc>
         <w:tc>
           <w:tcPr>
-            <w:tcW w:w="5135" w:type="dxa"/>
+            <w:tcW w:w="5136" w:type="dxa"/>
             <w:gridSpan w:val="9"/>
             <w:tcBorders>
               <w:top w:val="single" w:sz="4" w:space="0" w:color="000000"/>
@@ -4837,7 +4930,7 @@
         </w:tc>
         <w:tc>
           <w:tcPr>
-            <w:tcW w:w="3104" w:type="dxa"/>
+            <w:tcW w:w="3103" w:type="dxa"/>
             <w:gridSpan w:val="9"/>
             <w:tcBorders>
               <w:top w:val="single" w:sz="4" w:space="0" w:color="000000"/>
@@ -4873,7 +4966,7 @@
         </w:tc>
         <w:tc>
           <w:tcPr>
-            <w:tcW w:w="3109" w:type="dxa"/>
+            <w:tcW w:w="3110" w:type="dxa"/>
             <w:gridSpan w:val="3"/>
             <w:tcBorders>
               <w:top w:val="single" w:sz="4" w:space="0" w:color="000000"/>
@@ -8461,7 +8554,7 @@
         </w:tc>
         <w:tc>
           <w:tcPr>
-            <w:tcW w:w="854" w:type="dxa"/>
+            <w:tcW w:w="853" w:type="dxa"/>
             <w:gridSpan w:val="2"/>
             <w:tcBorders/>
             <w:vAlign w:val="bottom"/>
@@ -8494,7 +8587,7 @@
         </w:tc>
         <w:tc>
           <w:tcPr>
-            <w:tcW w:w="3747" w:type="dxa"/>
+            <w:tcW w:w="3748" w:type="dxa"/>
             <w:gridSpan w:val="5"/>
             <w:tcBorders/>
             <w:vAlign w:val="bottom"/>
@@ -8639,7 +8732,7 @@
           <w:bottom w:w="55" w:type="dxa"/>
           <w:end w:w="55" w:type="dxa"/>
         </w:tblCellMar>
-        <w:tblLook w:val="04a0" w:noHBand="0" w:noVBand="1" w:firstColumn="1" w:lastRow="0" w:lastColumn="0" w:firstRow="1"/>
+        <w:tblLook w:noHBand="0" w:noVBand="1" w:firstColumn="1" w:lastRow="0" w:lastColumn="0" w:firstRow="1" w:val="04a0"/>
       </w:tblPr>
       <w:tblGrid>
         <w:gridCol w:w="10772"/>
@@ -10180,7 +10273,7 @@
           <w:bottom w:w="0" w:type="dxa"/>
           <w:end w:w="108" w:type="dxa"/>
         </w:tblCellMar>
-        <w:tblLook w:val="04a0" w:noHBand="0" w:noVBand="1" w:firstColumn="1" w:lastRow="0" w:lastColumn="0" w:firstRow="1"/>
+        <w:tblLook w:noHBand="0" w:noVBand="1" w:firstColumn="1" w:lastRow="0" w:lastColumn="0" w:firstRow="1" w:val="04a0"/>
       </w:tblPr>
       <w:tblGrid>
         <w:gridCol w:w="5385"/>
@@ -10625,19 +10718,19 @@
                 <w:bottom w:w="0" w:type="dxa"/>
                 <w:end w:w="0" w:type="dxa"/>
               </w:tblCellMar>
-              <w:tblLook w:val="04a0" w:noHBand="0" w:noVBand="1" w:firstColumn="1" w:lastRow="0" w:lastColumn="0" w:firstRow="1"/>
+              <w:tblLook w:noHBand="0" w:noVBand="1" w:firstColumn="1" w:lastRow="0" w:lastColumn="0" w:firstRow="1" w:val="04a0"/>
             </w:tblPr>
             <w:tblGrid>
-              <w:gridCol w:w="765"/>
+              <w:gridCol w:w="764"/>
               <w:gridCol w:w="1017"/>
-              <w:gridCol w:w="803"/>
+              <w:gridCol w:w="804"/>
               <w:gridCol w:w="2586"/>
             </w:tblGrid>
             <w:tr>
               <w:trPr/>
               <w:tc>
                 <w:tcPr>
-                  <w:tcW w:w="765" w:type="dxa"/>
+                  <w:tcW w:w="764" w:type="dxa"/>
                   <w:tcBorders/>
                 </w:tcPr>
                 <w:p>
@@ -10669,7 +10762,7 @@
               </w:tc>
               <w:tc>
                 <w:tcPr>
-                  <w:tcW w:w="4406" w:type="dxa"/>
+                  <w:tcW w:w="4407" w:type="dxa"/>
                   <w:gridSpan w:val="3"/>
                   <w:tcBorders/>
                 </w:tcPr>
@@ -10749,7 +10842,7 @@
               <w:trPr/>
               <w:tc>
                 <w:tcPr>
-                  <w:tcW w:w="1782" w:type="dxa"/>
+                  <w:tcW w:w="1781" w:type="dxa"/>
                   <w:gridSpan w:val="2"/>
                   <w:tcBorders/>
                 </w:tcPr>
@@ -10782,7 +10875,7 @@
               </w:tc>
               <w:tc>
                 <w:tcPr>
-                  <w:tcW w:w="3389" w:type="dxa"/>
+                  <w:tcW w:w="3390" w:type="dxa"/>
                   <w:gridSpan w:val="2"/>
                   <w:tcBorders/>
                 </w:tcPr>
@@ -11550,22 +11643,22 @@
           <w:bottom w:w="0" w:type="dxa"/>
           <w:end w:w="30" w:type="dxa"/>
         </w:tblCellMar>
-        <w:tblLook w:val="04a0" w:noHBand="0" w:noVBand="1" w:firstColumn="1" w:lastRow="0" w:lastColumn="0" w:firstRow="1"/>
+        <w:tblLook w:noHBand="0" w:noVBand="1" w:firstColumn="1" w:lastRow="0" w:lastColumn="0" w:firstRow="1" w:val="04a0"/>
       </w:tblPr>
       <w:tblGrid>
         <w:gridCol w:w="1217"/>
-        <w:gridCol w:w="1376"/>
-        <w:gridCol w:w="846"/>
+        <w:gridCol w:w="1375"/>
+        <w:gridCol w:w="847"/>
         <w:gridCol w:w="293"/>
         <w:gridCol w:w="96"/>
         <w:gridCol w:w="1238"/>
-        <w:gridCol w:w="1029"/>
-        <w:gridCol w:w="107"/>
-        <w:gridCol w:w="1246"/>
+        <w:gridCol w:w="1028"/>
+        <w:gridCol w:w="108"/>
+        <w:gridCol w:w="1245"/>
         <w:gridCol w:w="1189"/>
-        <w:gridCol w:w="1193"/>
-        <w:gridCol w:w="858"/>
-        <w:gridCol w:w="84"/>
+        <w:gridCol w:w="1194"/>
+        <w:gridCol w:w="857"/>
+        <w:gridCol w:w="85"/>
       </w:tblGrid>
       <w:tr>
         <w:trPr>
@@ -11749,6 +11842,16 @@
                 <w:rFonts w:eastAsia="Noto Serif CJK SC" w:cs="Noto Sans Devanagari"/>
                 <w:b/>
                 <w:szCs w:val="28"/>
+                <w:lang w:val="en-US" w:eastAsia="zh-CN" w:bidi="hi-IN"/>
+                <w14:ligatures w14:val="none"/>
+              </w:rPr>
+              <w:t>_CONCL</w:t>
+            </w:r>
+            <w:r>
+              <w:rPr>
+                <w:rFonts w:eastAsia="Noto Serif CJK SC" w:cs="Noto Sans Devanagari"/>
+                <w:b/>
+                <w:szCs w:val="28"/>
                 <w:lang w:eastAsia="zh-CN" w:bidi="hi-IN"/>
                 <w14:ligatures w14:val="none"/>
               </w:rPr>
@@ -11766,7 +11869,7 @@
         </w:trPr>
         <w:tc>
           <w:tcPr>
-            <w:tcW w:w="2593" w:type="dxa"/>
+            <w:tcW w:w="2592" w:type="dxa"/>
             <w:gridSpan w:val="2"/>
             <w:tcBorders/>
             <w:vAlign w:val="bottom"/>
@@ -11807,7 +11910,7 @@
         </w:tc>
         <w:tc>
           <w:tcPr>
-            <w:tcW w:w="8179" w:type="dxa"/>
+            <w:tcW w:w="8180" w:type="dxa"/>
             <w:gridSpan w:val="11"/>
             <w:tcBorders/>
           </w:tcPr>
@@ -11879,7 +11982,7 @@
         </w:trPr>
         <w:tc>
           <w:tcPr>
-            <w:tcW w:w="2593" w:type="dxa"/>
+            <w:tcW w:w="2592" w:type="dxa"/>
             <w:gridSpan w:val="2"/>
             <w:tcBorders/>
             <w:vAlign w:val="bottom"/>
@@ -11952,7 +12055,7 @@
         </w:tc>
         <w:tc>
           <w:tcPr>
-            <w:tcW w:w="4677" w:type="dxa"/>
+            <w:tcW w:w="4678" w:type="dxa"/>
             <w:gridSpan w:val="6"/>
             <w:tcBorders/>
             <w:vAlign w:val="bottom"/>
@@ -12421,7 +12524,7 @@
         </w:trPr>
         <w:tc>
           <w:tcPr>
-            <w:tcW w:w="2593" w:type="dxa"/>
+            <w:tcW w:w="2592" w:type="dxa"/>
             <w:gridSpan w:val="2"/>
             <w:tcBorders/>
           </w:tcPr>
@@ -12460,7 +12563,7 @@
         </w:tc>
         <w:tc>
           <w:tcPr>
-            <w:tcW w:w="8179" w:type="dxa"/>
+            <w:tcW w:w="8180" w:type="dxa"/>
             <w:gridSpan w:val="11"/>
             <w:tcBorders/>
           </w:tcPr>
@@ -12551,17 +12654,7 @@
                 <w:lang w:val="en-US" w:eastAsia="zh-CN" w:bidi="hi-IN"/>
                 <w14:ligatures w14:val="none"/>
               </w:rPr>
-              <w:t>TYPE</w:t>
-            </w:r>
-            <w:r>
-              <w:rPr>
-                <w:rFonts w:eastAsia="Noto Serif CJK SC" w:cs="Noto Sans Devanagari"/>
-                <w:b/>
-                <w:szCs w:val="28"/>
-                <w:lang w:val="en-US" w:eastAsia="zh-CN" w:bidi="hi-IN"/>
-                <w14:ligatures w14:val="none"/>
-              </w:rPr>
-              <w:t>_FORMATTED</w:t>
+              <w:t>TYPE_FORMATTED</w:t>
             </w:r>
             <w:r>
               <w:rPr>
@@ -12712,7 +12805,7 @@
         </w:trPr>
         <w:tc>
           <w:tcPr>
-            <w:tcW w:w="10688" w:type="dxa"/>
+            <w:tcW w:w="10687" w:type="dxa"/>
             <w:gridSpan w:val="12"/>
             <w:tcBorders/>
             <w:vAlign w:val="center"/>
@@ -12741,7 +12834,7 @@
         </w:tc>
         <w:tc>
           <w:tcPr>
-            <w:tcW w:w="84" w:type="dxa"/>
+            <w:tcW w:w="85" w:type="dxa"/>
             <w:tcBorders/>
             <w:vAlign w:val="bottom"/>
           </w:tcPr>
@@ -12774,7 +12867,7 @@
         </w:trPr>
         <w:tc>
           <w:tcPr>
-            <w:tcW w:w="2593" w:type="dxa"/>
+            <w:tcW w:w="2592" w:type="dxa"/>
             <w:gridSpan w:val="2"/>
             <w:tcBorders/>
             <w:vAlign w:val="center"/>
@@ -12832,7 +12925,7 @@
         </w:tc>
         <w:tc>
           <w:tcPr>
-            <w:tcW w:w="1139" w:type="dxa"/>
+            <w:tcW w:w="1140" w:type="dxa"/>
             <w:gridSpan w:val="2"/>
             <w:tcBorders>
               <w:end w:val="single" w:sz="4" w:space="0" w:color="000000"/>
@@ -12899,7 +12992,7 @@
         </w:tc>
         <w:tc>
           <w:tcPr>
-            <w:tcW w:w="1029" w:type="dxa"/>
+            <w:tcW w:w="1028" w:type="dxa"/>
             <w:tcBorders>
               <w:start w:val="single" w:sz="4" w:space="0" w:color="000000"/>
               <w:end w:val="single" w:sz="4" w:space="0" w:color="000000"/>
@@ -12997,7 +13090,7 @@
         </w:tc>
         <w:tc>
           <w:tcPr>
-            <w:tcW w:w="1193" w:type="dxa"/>
+            <w:tcW w:w="1194" w:type="dxa"/>
             <w:tcBorders>
               <w:top w:val="single" w:sz="4" w:space="0" w:color="000000"/>
               <w:start w:val="single" w:sz="4" w:space="0" w:color="000000"/>
@@ -13032,7 +13125,7 @@
         </w:tc>
         <w:tc>
           <w:tcPr>
-            <w:tcW w:w="858" w:type="dxa"/>
+            <w:tcW w:w="857" w:type="dxa"/>
             <w:tcBorders>
               <w:start w:val="single" w:sz="4" w:space="0" w:color="000000"/>
             </w:tcBorders>
@@ -13062,7 +13155,7 @@
         </w:tc>
         <w:tc>
           <w:tcPr>
-            <w:tcW w:w="84" w:type="dxa"/>
+            <w:tcW w:w="85" w:type="dxa"/>
             <w:tcBorders/>
             <w:vAlign w:val="bottom"/>
           </w:tcPr>
@@ -13095,7 +13188,7 @@
         </w:trPr>
         <w:tc>
           <w:tcPr>
-            <w:tcW w:w="2593" w:type="dxa"/>
+            <w:tcW w:w="2592" w:type="dxa"/>
             <w:gridSpan w:val="2"/>
             <w:tcBorders/>
             <w:vAlign w:val="bottom"/>
@@ -13155,7 +13248,7 @@
         </w:tc>
         <w:tc>
           <w:tcPr>
-            <w:tcW w:w="84" w:type="dxa"/>
+            <w:tcW w:w="85" w:type="dxa"/>
             <w:tcBorders/>
             <w:vAlign w:val="bottom"/>
           </w:tcPr>
@@ -13216,7 +13309,7 @@
         </w:tc>
         <w:tc>
           <w:tcPr>
-            <w:tcW w:w="1376" w:type="dxa"/>
+            <w:tcW w:w="1375" w:type="dxa"/>
             <w:tcBorders/>
             <w:vAlign w:val="bottom"/>
           </w:tcPr>
@@ -13244,7 +13337,7 @@
         </w:tc>
         <w:tc>
           <w:tcPr>
-            <w:tcW w:w="1139" w:type="dxa"/>
+            <w:tcW w:w="1140" w:type="dxa"/>
             <w:gridSpan w:val="2"/>
             <w:tcBorders/>
             <w:vAlign w:val="bottom"/>
@@ -13302,7 +13395,7 @@
         </w:tc>
         <w:tc>
           <w:tcPr>
-            <w:tcW w:w="1029" w:type="dxa"/>
+            <w:tcW w:w="1028" w:type="dxa"/>
             <w:tcBorders/>
             <w:vAlign w:val="bottom"/>
           </w:tcPr>
@@ -13387,7 +13480,7 @@
         </w:tc>
         <w:tc>
           <w:tcPr>
-            <w:tcW w:w="1193" w:type="dxa"/>
+            <w:tcW w:w="1194" w:type="dxa"/>
             <w:tcBorders/>
             <w:vAlign w:val="bottom"/>
           </w:tcPr>
@@ -13417,7 +13510,7 @@
         </w:tc>
         <w:tc>
           <w:tcPr>
-            <w:tcW w:w="858" w:type="dxa"/>
+            <w:tcW w:w="857" w:type="dxa"/>
             <w:tcBorders/>
             <w:vAlign w:val="bottom"/>
           </w:tcPr>
@@ -13447,7 +13540,7 @@
         </w:tc>
         <w:tc>
           <w:tcPr>
-            <w:tcW w:w="84" w:type="dxa"/>
+            <w:tcW w:w="85" w:type="dxa"/>
             <w:tcBorders/>
             <w:vAlign w:val="bottom"/>
           </w:tcPr>
@@ -13552,7 +13645,7 @@
         </w:tc>
         <w:tc>
           <w:tcPr>
-            <w:tcW w:w="2382" w:type="dxa"/>
+            <w:tcW w:w="2381" w:type="dxa"/>
             <w:gridSpan w:val="3"/>
             <w:tcBorders>
               <w:bottom w:val="single" w:sz="4" w:space="0" w:color="000000"/>
@@ -13635,7 +13728,7 @@
         </w:tc>
         <w:tc>
           <w:tcPr>
-            <w:tcW w:w="84" w:type="dxa"/>
+            <w:tcW w:w="85" w:type="dxa"/>
             <w:tcBorders/>
             <w:vAlign w:val="bottom"/>
           </w:tcPr>
@@ -13696,7 +13789,7 @@
         </w:tc>
         <w:tc>
           <w:tcPr>
-            <w:tcW w:w="1376" w:type="dxa"/>
+            <w:tcW w:w="1375" w:type="dxa"/>
             <w:tcBorders/>
             <w:vAlign w:val="bottom"/>
           </w:tcPr>
@@ -13724,7 +13817,7 @@
         </w:tc>
         <w:tc>
           <w:tcPr>
-            <w:tcW w:w="1139" w:type="dxa"/>
+            <w:tcW w:w="1140" w:type="dxa"/>
             <w:gridSpan w:val="2"/>
             <w:tcBorders/>
             <w:vAlign w:val="bottom"/>
@@ -13782,7 +13875,7 @@
         </w:tc>
         <w:tc>
           <w:tcPr>
-            <w:tcW w:w="1029" w:type="dxa"/>
+            <w:tcW w:w="1028" w:type="dxa"/>
             <w:tcBorders/>
             <w:vAlign w:val="bottom"/>
           </w:tcPr>
@@ -13867,7 +13960,7 @@
         </w:tc>
         <w:tc>
           <w:tcPr>
-            <w:tcW w:w="1193" w:type="dxa"/>
+            <w:tcW w:w="1194" w:type="dxa"/>
             <w:tcBorders/>
             <w:vAlign w:val="bottom"/>
           </w:tcPr>
@@ -13895,7 +13988,7 @@
         </w:tc>
         <w:tc>
           <w:tcPr>
-            <w:tcW w:w="858" w:type="dxa"/>
+            <w:tcW w:w="857" w:type="dxa"/>
             <w:tcBorders/>
             <w:vAlign w:val="bottom"/>
           </w:tcPr>
@@ -13923,7 +14016,7 @@
         </w:tc>
         <w:tc>
           <w:tcPr>
-            <w:tcW w:w="84" w:type="dxa"/>
+            <w:tcW w:w="85" w:type="dxa"/>
             <w:tcBorders/>
             <w:vAlign w:val="bottom"/>
           </w:tcPr>
@@ -13984,7 +14077,7 @@
         </w:tc>
         <w:tc>
           <w:tcPr>
-            <w:tcW w:w="1376" w:type="dxa"/>
+            <w:tcW w:w="1375" w:type="dxa"/>
             <w:tcBorders/>
             <w:vAlign w:val="bottom"/>
           </w:tcPr>
@@ -14012,7 +14105,7 @@
         </w:tc>
         <w:tc>
           <w:tcPr>
-            <w:tcW w:w="1139" w:type="dxa"/>
+            <w:tcW w:w="1140" w:type="dxa"/>
             <w:gridSpan w:val="2"/>
             <w:tcBorders/>
             <w:vAlign w:val="bottom"/>
@@ -14070,7 +14163,7 @@
         </w:tc>
         <w:tc>
           <w:tcPr>
-            <w:tcW w:w="1029" w:type="dxa"/>
+            <w:tcW w:w="1028" w:type="dxa"/>
             <w:tcBorders/>
             <w:vAlign w:val="center"/>
           </w:tcPr>
@@ -14155,7 +14248,7 @@
         </w:tc>
         <w:tc>
           <w:tcPr>
-            <w:tcW w:w="1193" w:type="dxa"/>
+            <w:tcW w:w="1194" w:type="dxa"/>
             <w:tcBorders/>
             <w:vAlign w:val="bottom"/>
           </w:tcPr>
@@ -14183,7 +14276,7 @@
         </w:tc>
         <w:tc>
           <w:tcPr>
-            <w:tcW w:w="858" w:type="dxa"/>
+            <w:tcW w:w="857" w:type="dxa"/>
             <w:tcBorders/>
             <w:vAlign w:val="bottom"/>
           </w:tcPr>
@@ -14211,7 +14304,7 @@
         </w:tc>
         <w:tc>
           <w:tcPr>
-            <w:tcW w:w="84" w:type="dxa"/>
+            <w:tcW w:w="85" w:type="dxa"/>
             <w:tcBorders/>
             <w:vAlign w:val="bottom"/>
           </w:tcPr>
@@ -14272,7 +14365,7 @@
         </w:tc>
         <w:tc>
           <w:tcPr>
-            <w:tcW w:w="1376" w:type="dxa"/>
+            <w:tcW w:w="1375" w:type="dxa"/>
             <w:tcBorders/>
             <w:vAlign w:val="bottom"/>
           </w:tcPr>
@@ -14300,7 +14393,7 @@
         </w:tc>
         <w:tc>
           <w:tcPr>
-            <w:tcW w:w="1139" w:type="dxa"/>
+            <w:tcW w:w="1140" w:type="dxa"/>
             <w:gridSpan w:val="2"/>
             <w:tcBorders/>
             <w:vAlign w:val="bottom"/>
@@ -14358,7 +14451,7 @@
         </w:tc>
         <w:tc>
           <w:tcPr>
-            <w:tcW w:w="1029" w:type="dxa"/>
+            <w:tcW w:w="1028" w:type="dxa"/>
             <w:tcBorders/>
             <w:vAlign w:val="center"/>
           </w:tcPr>
@@ -14422,7 +14515,7 @@
         </w:tc>
         <w:tc>
           <w:tcPr>
-            <w:tcW w:w="1193" w:type="dxa"/>
+            <w:tcW w:w="1194" w:type="dxa"/>
             <w:tcBorders/>
             <w:vAlign w:val="bottom"/>
           </w:tcPr>
@@ -14450,7 +14543,7 @@
         </w:tc>
         <w:tc>
           <w:tcPr>
-            <w:tcW w:w="858" w:type="dxa"/>
+            <w:tcW w:w="857" w:type="dxa"/>
             <w:tcBorders/>
             <w:vAlign w:val="bottom"/>
           </w:tcPr>
@@ -14478,7 +14571,7 @@
         </w:tc>
         <w:tc>
           <w:tcPr>
-            <w:tcW w:w="84" w:type="dxa"/>
+            <w:tcW w:w="85" w:type="dxa"/>
             <w:tcBorders/>
             <w:vAlign w:val="bottom"/>
           </w:tcPr>
@@ -14539,7 +14632,7 @@
         </w:tc>
         <w:tc>
           <w:tcPr>
-            <w:tcW w:w="1376" w:type="dxa"/>
+            <w:tcW w:w="1375" w:type="dxa"/>
             <w:tcBorders/>
             <w:vAlign w:val="bottom"/>
           </w:tcPr>
@@ -14567,7 +14660,7 @@
         </w:tc>
         <w:tc>
           <w:tcPr>
-            <w:tcW w:w="1139" w:type="dxa"/>
+            <w:tcW w:w="1140" w:type="dxa"/>
             <w:gridSpan w:val="2"/>
             <w:tcBorders/>
             <w:vAlign w:val="bottom"/>
@@ -14625,7 +14718,7 @@
         </w:tc>
         <w:tc>
           <w:tcPr>
-            <w:tcW w:w="1029" w:type="dxa"/>
+            <w:tcW w:w="1028" w:type="dxa"/>
             <w:tcBorders/>
             <w:vAlign w:val="center"/>
           </w:tcPr>
@@ -14714,7 +14807,7 @@
         </w:tc>
         <w:tc>
           <w:tcPr>
-            <w:tcW w:w="1193" w:type="dxa"/>
+            <w:tcW w:w="1194" w:type="dxa"/>
             <w:tcBorders/>
             <w:vAlign w:val="bottom"/>
           </w:tcPr>
@@ -14742,7 +14835,7 @@
         </w:tc>
         <w:tc>
           <w:tcPr>
-            <w:tcW w:w="858" w:type="dxa"/>
+            <w:tcW w:w="857" w:type="dxa"/>
             <w:tcBorders/>
             <w:vAlign w:val="bottom"/>
           </w:tcPr>
@@ -14770,7 +14863,7 @@
         </w:tc>
         <w:tc>
           <w:tcPr>
-            <w:tcW w:w="84" w:type="dxa"/>
+            <w:tcW w:w="85" w:type="dxa"/>
             <w:tcBorders/>
             <w:vAlign w:val="bottom"/>
           </w:tcPr>
@@ -14833,7 +14926,7 @@
         </w:tc>
         <w:tc>
           <w:tcPr>
-            <w:tcW w:w="1376" w:type="dxa"/>
+            <w:tcW w:w="1375" w:type="dxa"/>
             <w:tcBorders/>
             <w:vAlign w:val="bottom"/>
           </w:tcPr>
@@ -14861,7 +14954,7 @@
         </w:tc>
         <w:tc>
           <w:tcPr>
-            <w:tcW w:w="1139" w:type="dxa"/>
+            <w:tcW w:w="1140" w:type="dxa"/>
             <w:gridSpan w:val="2"/>
             <w:tcBorders/>
             <w:vAlign w:val="bottom"/>
@@ -14890,7 +14983,7 @@
         </w:tc>
         <w:tc>
           <w:tcPr>
-            <w:tcW w:w="6956" w:type="dxa"/>
+            <w:tcW w:w="6955" w:type="dxa"/>
             <w:gridSpan w:val="8"/>
             <w:tcBorders/>
             <w:vAlign w:val="bottom"/>
@@ -14921,7 +15014,7 @@
         </w:tc>
         <w:tc>
           <w:tcPr>
-            <w:tcW w:w="84" w:type="dxa"/>
+            <w:tcW w:w="85" w:type="dxa"/>
             <w:tcBorders/>
             <w:vAlign w:val="bottom"/>
           </w:tcPr>
@@ -17812,37 +17905,37 @@
         <a:srgbClr val="000000"/>
       </a:dk1>
       <a:lt1>
-        <a:srgbClr val="ffffff"/>
+        <a:srgbClr val="FFFFFF"/>
       </a:lt1>
       <a:dk2>
-        <a:srgbClr val="44546a"/>
+        <a:srgbClr val="44546A"/>
       </a:dk2>
       <a:lt2>
-        <a:srgbClr val="e7e6e6"/>
+        <a:srgbClr val="E7E6E6"/>
       </a:lt2>
       <a:accent1>
-        <a:srgbClr val="5b9bd5"/>
+        <a:srgbClr val="5B9BD5"/>
       </a:accent1>
       <a:accent2>
-        <a:srgbClr val="ed7d31"/>
+        <a:srgbClr val="ED7D31"/>
       </a:accent2>
       <a:accent3>
-        <a:srgbClr val="a5a5a5"/>
+        <a:srgbClr val="A5A5A5"/>
       </a:accent3>
       <a:accent4>
-        <a:srgbClr val="ffc000"/>
+        <a:srgbClr val="FFC000"/>
       </a:accent4>
       <a:accent5>
-        <a:srgbClr val="4472c4"/>
+        <a:srgbClr val="4472C4"/>
       </a:accent5>
       <a:accent6>
-        <a:srgbClr val="70ad47"/>
+        <a:srgbClr val="70AD47"/>
       </a:accent6>
       <a:hlink>
-        <a:srgbClr val="0563c1"/>
+        <a:srgbClr val="0563C1"/>
       </a:hlink>
       <a:folHlink>
-        <a:srgbClr val="954f72"/>
+        <a:srgbClr val="954F72"/>
       </a:folHlink>
     </a:clrScheme>
     <a:fontScheme name="Стандартная">

</xml_diff>